<commit_message>
project-1: elaborated on the accessibility plan and added a few buttons to the sketch
</commit_message>
<xml_diff>
--- a/projects/project-1/Project_1_Sketch.docx
+++ b/projects/project-1/Project_1_Sketch.docx
@@ -768,6 +768,261 @@
         </w:rPr>
         <w:lastRenderedPageBreak/>
         <mc:AlternateContent>
+          <mc:Choice Requires="wps">
+            <w:drawing>
+              <wp:anchor distT="0" distB="0" distL="114300" distR="114300" simplePos="0" relativeHeight="251697152" behindDoc="0" locked="0" layoutInCell="1" allowOverlap="1" wp14:anchorId="378B6572" wp14:editId="4B5DDD21">
+                <wp:simplePos x="0" y="0"/>
+                <wp:positionH relativeFrom="column">
+                  <wp:posOffset>4290527</wp:posOffset>
+                </wp:positionH>
+                <wp:positionV relativeFrom="paragraph">
+                  <wp:posOffset>-19685</wp:posOffset>
+                </wp:positionV>
+                <wp:extent cx="1297821" cy="271145"/>
+                <wp:effectExtent l="0" t="0" r="10795" b="8255"/>
+                <wp:wrapNone/>
+                <wp:docPr id="166710549" name="Text Box 16"/>
+                <wp:cNvGraphicFramePr/>
+                <a:graphic xmlns:a="http://schemas.openxmlformats.org/drawingml/2006/main">
+                  <a:graphicData uri="http://schemas.microsoft.com/office/word/2010/wordprocessingShape">
+                    <wps:wsp>
+                      <wps:cNvSpPr txBox="1"/>
+                      <wps:spPr>
+                        <a:xfrm>
+                          <a:off x="0" y="0"/>
+                          <a:ext cx="1297821" cy="271145"/>
+                        </a:xfrm>
+                        <a:prstGeom prst="rect">
+                          <a:avLst/>
+                        </a:prstGeom>
+                        <a:solidFill>
+                          <a:schemeClr val="lt1"/>
+                        </a:solidFill>
+                        <a:ln w="6350">
+                          <a:solidFill>
+                            <a:prstClr val="black"/>
+                          </a:solidFill>
+                        </a:ln>
+                      </wps:spPr>
+                      <wps:txbx>
+                        <w:txbxContent>
+                          <w:p>
+                            <w:r>
+                              <w:t>M</w:t>
+                            </w:r>
+                            <w:r>
+                              <w:t>ax battery life:</w:t>
+                            </w:r>
+                          </w:p>
+                        </w:txbxContent>
+                      </wps:txbx>
+                      <wps:bodyPr rot="0" spcFirstLastPara="0" vertOverflow="overflow" horzOverflow="overflow" vert="horz" wrap="square" lIns="91440" tIns="45720" rIns="91440" bIns="45720" numCol="1" spcCol="0" rtlCol="0" fromWordArt="0" anchor="t" anchorCtr="0" forceAA="0" compatLnSpc="1">
+                        <a:prstTxWarp prst="textNoShape">
+                          <a:avLst/>
+                        </a:prstTxWarp>
+                        <a:noAutofit/>
+                      </wps:bodyPr>
+                    </wps:wsp>
+                  </a:graphicData>
+                </a:graphic>
+                <wp14:sizeRelH relativeFrom="margin">
+                  <wp14:pctWidth>0</wp14:pctWidth>
+                </wp14:sizeRelH>
+              </wp:anchor>
+            </w:drawing>
+          </mc:Choice>
+          <mc:Fallback>
+            <w:pict>
+              <v:shape w14:anchorId="378B6572" id="Text Box 16" o:spid="_x0000_s1031" type="#_x0000_t202" style="position:absolute;margin-left:337.85pt;margin-top:-1.55pt;width:102.2pt;height:21.35pt;z-index:251697152;visibility:visible;mso-wrap-style:square;mso-width-percent:0;mso-wrap-distance-left:9pt;mso-wrap-distance-top:0;mso-wrap-distance-right:9pt;mso-wrap-distance-bottom:0;mso-position-horizontal:absolute;mso-position-horizontal-relative:text;mso-position-vertical:absolute;mso-position-vertical-relative:text;mso-width-percent:0;mso-width-relative:margin;v-text-anchor:top" o:gfxdata="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" fillcolor="white [3201]" strokeweight=".5pt">
+                <v:textbox>
+                  <w:txbxContent>
+                    <w:p>
+                      <w:r>
+                        <w:t>M</w:t>
+                      </w:r>
+                      <w:r>
+                        <w:t>ax battery life:</w:t>
+                      </w:r>
+                    </w:p>
+                  </w:txbxContent>
+                </v:textbox>
+              </v:shape>
+            </w:pict>
+          </mc:Fallback>
+        </mc:AlternateContent>
+      </w:r>
+      <w:r>
+        <w:rPr>
+          <w:noProof/>
+        </w:rPr>
+        <mc:AlternateContent>
+          <mc:Choice Requires="wps">
+            <w:drawing>
+              <wp:anchor distT="0" distB="0" distL="114300" distR="114300" simplePos="0" relativeHeight="251696128" behindDoc="0" locked="0" layoutInCell="1" allowOverlap="1" wp14:anchorId="0A88A734" wp14:editId="11A5D245">
+                <wp:simplePos x="0" y="0"/>
+                <wp:positionH relativeFrom="column">
+                  <wp:posOffset>3044218</wp:posOffset>
+                </wp:positionH>
+                <wp:positionV relativeFrom="paragraph">
+                  <wp:posOffset>-19685</wp:posOffset>
+                </wp:positionV>
+                <wp:extent cx="1155623" cy="271145"/>
+                <wp:effectExtent l="0" t="0" r="13335" b="8255"/>
+                <wp:wrapNone/>
+                <wp:docPr id="1274595744" name="Text Box 15"/>
+                <wp:cNvGraphicFramePr/>
+                <a:graphic xmlns:a="http://schemas.openxmlformats.org/drawingml/2006/main">
+                  <a:graphicData uri="http://schemas.microsoft.com/office/word/2010/wordprocessingShape">
+                    <wps:wsp>
+                      <wps:cNvSpPr txBox="1"/>
+                      <wps:spPr>
+                        <a:xfrm>
+                          <a:off x="0" y="0"/>
+                          <a:ext cx="1155623" cy="271145"/>
+                        </a:xfrm>
+                        <a:prstGeom prst="rect">
+                          <a:avLst/>
+                        </a:prstGeom>
+                        <a:solidFill>
+                          <a:schemeClr val="lt1"/>
+                        </a:solidFill>
+                        <a:ln w="6350">
+                          <a:solidFill>
+                            <a:prstClr val="black"/>
+                          </a:solidFill>
+                        </a:ln>
+                      </wps:spPr>
+                      <wps:txbx>
+                        <w:txbxContent>
+                          <w:p>
+                            <w:r>
+                              <w:t>Max distance:</w:t>
+                            </w:r>
+                          </w:p>
+                        </w:txbxContent>
+                      </wps:txbx>
+                      <wps:bodyPr rot="0" spcFirstLastPara="0" vertOverflow="overflow" horzOverflow="overflow" vert="horz" wrap="square" lIns="91440" tIns="45720" rIns="91440" bIns="45720" numCol="1" spcCol="0" rtlCol="0" fromWordArt="0" anchor="t" anchorCtr="0" forceAA="0" compatLnSpc="1">
+                        <a:prstTxWarp prst="textNoShape">
+                          <a:avLst/>
+                        </a:prstTxWarp>
+                        <a:noAutofit/>
+                      </wps:bodyPr>
+                    </wps:wsp>
+                  </a:graphicData>
+                </a:graphic>
+              </wp:anchor>
+            </w:drawing>
+          </mc:Choice>
+          <mc:Fallback>
+            <w:pict>
+              <v:shape w14:anchorId="0A88A734" id="Text Box 15" o:spid="_x0000_s1032" type="#_x0000_t202" style="position:absolute;margin-left:239.7pt;margin-top:-1.55pt;width:91pt;height:21.35pt;z-index:251696128;visibility:visible;mso-wrap-style:square;mso-wrap-distance-left:9pt;mso-wrap-distance-top:0;mso-wrap-distance-right:9pt;mso-wrap-distance-bottom:0;mso-position-horizontal:absolute;mso-position-horizontal-relative:text;mso-position-vertical:absolute;mso-position-vertical-relative:text;v-text-anchor:top" o:gfxdata="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" fillcolor="white [3201]" strokeweight=".5pt">
+                <v:textbox>
+                  <w:txbxContent>
+                    <w:p>
+                      <w:r>
+                        <w:t>Max distance:</w:t>
+                      </w:r>
+                    </w:p>
+                  </w:txbxContent>
+                </v:textbox>
+              </v:shape>
+            </w:pict>
+          </mc:Fallback>
+        </mc:AlternateContent>
+      </w:r>
+      <w:r>
+        <w:rPr>
+          <w:noProof/>
+        </w:rPr>
+        <mc:AlternateContent>
+          <mc:Choice Requires="wps">
+            <w:drawing>
+              <wp:anchor distT="0" distB="0" distL="114300" distR="114300" simplePos="0" relativeHeight="251695104" behindDoc="0" locked="0" layoutInCell="1" allowOverlap="1" wp14:anchorId="4E9FE7FB" wp14:editId="17D8591C">
+                <wp:simplePos x="0" y="0"/>
+                <wp:positionH relativeFrom="column">
+                  <wp:posOffset>1606697</wp:posOffset>
+                </wp:positionH>
+                <wp:positionV relativeFrom="paragraph">
+                  <wp:posOffset>-19685</wp:posOffset>
+                </wp:positionV>
+                <wp:extent cx="1356527" cy="271306"/>
+                <wp:effectExtent l="0" t="0" r="15240" b="8255"/>
+                <wp:wrapNone/>
+                <wp:docPr id="99426916" name="Text Box 13"/>
+                <wp:cNvGraphicFramePr/>
+                <a:graphic xmlns:a="http://schemas.openxmlformats.org/drawingml/2006/main">
+                  <a:graphicData uri="http://schemas.microsoft.com/office/word/2010/wordprocessingShape">
+                    <wps:wsp>
+                      <wps:cNvSpPr txBox="1"/>
+                      <wps:spPr>
+                        <a:xfrm>
+                          <a:off x="0" y="0"/>
+                          <a:ext cx="1356527" cy="271306"/>
+                        </a:xfrm>
+                        <a:prstGeom prst="rect">
+                          <a:avLst/>
+                        </a:prstGeom>
+                        <a:solidFill>
+                          <a:schemeClr val="lt1"/>
+                        </a:solidFill>
+                        <a:ln w="6350">
+                          <a:solidFill>
+                            <a:prstClr val="black"/>
+                          </a:solidFill>
+                        </a:ln>
+                      </wps:spPr>
+                      <wps:txbx>
+                        <w:txbxContent>
+                          <w:p>
+                            <w:r>
+                              <w:t>Ma</w:t>
+                            </w:r>
+                            <w:r>
+                              <w:t>ximum price:</w:t>
+                            </w:r>
+                          </w:p>
+                        </w:txbxContent>
+                      </wps:txbx>
+                      <wps:bodyPr rot="0" spcFirstLastPara="0" vertOverflow="overflow" horzOverflow="overflow" vert="horz" wrap="square" lIns="91440" tIns="45720" rIns="91440" bIns="45720" numCol="1" spcCol="0" rtlCol="0" fromWordArt="0" anchor="t" anchorCtr="0" forceAA="0" compatLnSpc="1">
+                        <a:prstTxWarp prst="textNoShape">
+                          <a:avLst/>
+                        </a:prstTxWarp>
+                        <a:noAutofit/>
+                      </wps:bodyPr>
+                    </wps:wsp>
+                  </a:graphicData>
+                </a:graphic>
+                <wp14:sizeRelH relativeFrom="margin">
+                  <wp14:pctWidth>0</wp14:pctWidth>
+                </wp14:sizeRelH>
+              </wp:anchor>
+            </w:drawing>
+          </mc:Choice>
+          <mc:Fallback>
+            <w:pict>
+              <v:shape w14:anchorId="4E9FE7FB" id="Text Box 13" o:spid="_x0000_s1033" type="#_x0000_t202" style="position:absolute;margin-left:126.5pt;margin-top:-1.55pt;width:106.8pt;height:21.35pt;z-index:251695104;visibility:visible;mso-wrap-style:square;mso-width-percent:0;mso-wrap-distance-left:9pt;mso-wrap-distance-top:0;mso-wrap-distance-right:9pt;mso-wrap-distance-bottom:0;mso-position-horizontal:absolute;mso-position-horizontal-relative:text;mso-position-vertical:absolute;mso-position-vertical-relative:text;mso-width-percent:0;mso-width-relative:margin;v-text-anchor:top" o:gfxdata="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" fillcolor="white [3201]" strokeweight=".5pt">
+                <v:textbox>
+                  <w:txbxContent>
+                    <w:p>
+                      <w:r>
+                        <w:t>Ma</w:t>
+                      </w:r>
+                      <w:r>
+                        <w:t>ximum price:</w:t>
+                      </w:r>
+                    </w:p>
+                  </w:txbxContent>
+                </v:textbox>
+              </v:shape>
+            </w:pict>
+          </mc:Fallback>
+        </mc:AlternateContent>
+      </w:r>
+      <w:r>
+        <w:rPr>
+          <w:noProof/>
+        </w:rPr>
+        <mc:AlternateContent>
           <mc:Choice Requires="wpi">
             <w:drawing>
               <wp:anchor distT="0" distB="0" distL="114300" distR="114300" simplePos="0" relativeHeight="251674624" behindDoc="0" locked="0" layoutInCell="1" allowOverlap="1" wp14:anchorId="0E957C2F" wp14:editId="2FDDBF1B">
@@ -1028,7 +1283,172 @@
       </w:r>
     </w:p>
     <w:p/>
-    <w:p/>
+    <w:p>
+      <w:r>
+        <w:rPr>
+          <w:noProof/>
+        </w:rPr>
+        <mc:AlternateContent>
+          <mc:Choice Requires="wps">
+            <w:drawing>
+              <wp:anchor distT="0" distB="0" distL="114300" distR="114300" simplePos="0" relativeHeight="251688960" behindDoc="0" locked="0" layoutInCell="1" allowOverlap="1" wp14:anchorId="551BFCED" wp14:editId="6761B927">
+                <wp:simplePos x="0" y="0"/>
+                <wp:positionH relativeFrom="column">
+                  <wp:posOffset>4431323</wp:posOffset>
+                </wp:positionH>
+                <wp:positionV relativeFrom="paragraph">
+                  <wp:posOffset>50242</wp:posOffset>
+                </wp:positionV>
+                <wp:extent cx="1024932" cy="492370"/>
+                <wp:effectExtent l="0" t="0" r="16510" b="15875"/>
+                <wp:wrapNone/>
+                <wp:docPr id="1972988467" name="Text Box 10"/>
+                <wp:cNvGraphicFramePr/>
+                <a:graphic xmlns:a="http://schemas.openxmlformats.org/drawingml/2006/main">
+                  <a:graphicData uri="http://schemas.microsoft.com/office/word/2010/wordprocessingShape">
+                    <wps:wsp>
+                      <wps:cNvSpPr txBox="1"/>
+                      <wps:spPr>
+                        <a:xfrm>
+                          <a:off x="0" y="0"/>
+                          <a:ext cx="1024932" cy="492370"/>
+                        </a:xfrm>
+                        <a:prstGeom prst="rect">
+                          <a:avLst/>
+                        </a:prstGeom>
+                        <a:solidFill>
+                          <a:schemeClr val="lt1"/>
+                        </a:solidFill>
+                        <a:ln w="6350">
+                          <a:solidFill>
+                            <a:prstClr val="black"/>
+                          </a:solidFill>
+                        </a:ln>
+                      </wps:spPr>
+                      <wps:txbx>
+                        <w:txbxContent>
+                          <w:p>
+                            <w:r>
+                              <w:t>Add to cart button</w:t>
+                            </w:r>
+                          </w:p>
+                        </w:txbxContent>
+                      </wps:txbx>
+                      <wps:bodyPr rot="0" spcFirstLastPara="0" vertOverflow="overflow" horzOverflow="overflow" vert="horz" wrap="square" lIns="91440" tIns="45720" rIns="91440" bIns="45720" numCol="1" spcCol="0" rtlCol="0" fromWordArt="0" anchor="t" anchorCtr="0" forceAA="0" compatLnSpc="1">
+                        <a:prstTxWarp prst="textNoShape">
+                          <a:avLst/>
+                        </a:prstTxWarp>
+                        <a:noAutofit/>
+                      </wps:bodyPr>
+                    </wps:wsp>
+                  </a:graphicData>
+                </a:graphic>
+                <wp14:sizeRelV relativeFrom="margin">
+                  <wp14:pctHeight>0</wp14:pctHeight>
+                </wp14:sizeRelV>
+              </wp:anchor>
+            </w:drawing>
+          </mc:Choice>
+          <mc:Fallback>
+            <w:pict>
+              <v:shape w14:anchorId="551BFCED" id="_x0000_s1034" type="#_x0000_t202" style="position:absolute;margin-left:348.9pt;margin-top:3.95pt;width:80.7pt;height:38.75pt;z-index:251688960;visibility:visible;mso-wrap-style:square;mso-height-percent:0;mso-wrap-distance-left:9pt;mso-wrap-distance-top:0;mso-wrap-distance-right:9pt;mso-wrap-distance-bottom:0;mso-position-horizontal:absolute;mso-position-horizontal-relative:text;mso-position-vertical:absolute;mso-position-vertical-relative:text;mso-height-percent:0;mso-height-relative:margin;v-text-anchor:top" o:gfxdata="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" fillcolor="white [3201]" strokeweight=".5pt">
+                <v:textbox>
+                  <w:txbxContent>
+                    <w:p>
+                      <w:r>
+                        <w:t>Add to cart button</w:t>
+                      </w:r>
+                    </w:p>
+                  </w:txbxContent>
+                </v:textbox>
+              </v:shape>
+            </w:pict>
+          </mc:Fallback>
+        </mc:AlternateContent>
+      </w:r>
+      <w:r>
+        <w:rPr>
+          <w:noProof/>
+        </w:rPr>
+        <mc:AlternateContent>
+          <mc:Choice Requires="wps">
+            <w:drawing>
+              <wp:anchor distT="0" distB="0" distL="114300" distR="114300" simplePos="0" relativeHeight="251686912" behindDoc="0" locked="0" layoutInCell="1" allowOverlap="1" wp14:anchorId="1E86FEF3" wp14:editId="1633D66A">
+                <wp:simplePos x="0" y="0"/>
+                <wp:positionH relativeFrom="column">
+                  <wp:posOffset>1396721</wp:posOffset>
+                </wp:positionH>
+                <wp:positionV relativeFrom="paragraph">
+                  <wp:posOffset>107210</wp:posOffset>
+                </wp:positionV>
+                <wp:extent cx="1024932" cy="492370"/>
+                <wp:effectExtent l="0" t="0" r="16510" b="15875"/>
+                <wp:wrapNone/>
+                <wp:docPr id="1682575166" name="Text Box 10"/>
+                <wp:cNvGraphicFramePr/>
+                <a:graphic xmlns:a="http://schemas.openxmlformats.org/drawingml/2006/main">
+                  <a:graphicData uri="http://schemas.microsoft.com/office/word/2010/wordprocessingShape">
+                    <wps:wsp>
+                      <wps:cNvSpPr txBox="1"/>
+                      <wps:spPr>
+                        <a:xfrm>
+                          <a:off x="0" y="0"/>
+                          <a:ext cx="1024932" cy="492370"/>
+                        </a:xfrm>
+                        <a:prstGeom prst="rect">
+                          <a:avLst/>
+                        </a:prstGeom>
+                        <a:solidFill>
+                          <a:schemeClr val="lt1"/>
+                        </a:solidFill>
+                        <a:ln w="6350">
+                          <a:solidFill>
+                            <a:prstClr val="black"/>
+                          </a:solidFill>
+                        </a:ln>
+                      </wps:spPr>
+                      <wps:txbx>
+                        <w:txbxContent>
+                          <w:p>
+                            <w:r>
+                              <w:t>Add to cart button</w:t>
+                            </w:r>
+                          </w:p>
+                        </w:txbxContent>
+                      </wps:txbx>
+                      <wps:bodyPr rot="0" spcFirstLastPara="0" vertOverflow="overflow" horzOverflow="overflow" vert="horz" wrap="square" lIns="91440" tIns="45720" rIns="91440" bIns="45720" numCol="1" spcCol="0" rtlCol="0" fromWordArt="0" anchor="t" anchorCtr="0" forceAA="0" compatLnSpc="1">
+                        <a:prstTxWarp prst="textNoShape">
+                          <a:avLst/>
+                        </a:prstTxWarp>
+                        <a:noAutofit/>
+                      </wps:bodyPr>
+                    </wps:wsp>
+                  </a:graphicData>
+                </a:graphic>
+                <wp14:sizeRelV relativeFrom="margin">
+                  <wp14:pctHeight>0</wp14:pctHeight>
+                </wp14:sizeRelV>
+              </wp:anchor>
+            </w:drawing>
+          </mc:Choice>
+          <mc:Fallback>
+            <w:pict>
+              <v:shape w14:anchorId="1E86FEF3" id="_x0000_s1035" type="#_x0000_t202" style="position:absolute;margin-left:110pt;margin-top:8.45pt;width:80.7pt;height:38.75pt;z-index:251686912;visibility:visible;mso-wrap-style:square;mso-height-percent:0;mso-wrap-distance-left:9pt;mso-wrap-distance-top:0;mso-wrap-distance-right:9pt;mso-wrap-distance-bottom:0;mso-position-horizontal:absolute;mso-position-horizontal-relative:text;mso-position-vertical:absolute;mso-position-vertical-relative:text;mso-height-percent:0;mso-height-relative:margin;v-text-anchor:top" o:gfxdata="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" fillcolor="white [3201]" strokeweight=".5pt">
+                <v:textbox>
+                  <w:txbxContent>
+                    <w:p>
+                      <w:r>
+                        <w:t>Add to cart button</w:t>
+                      </w:r>
+                    </w:p>
+                  </w:txbxContent>
+                </v:textbox>
+              </v:shape>
+            </w:pict>
+          </mc:Fallback>
+        </mc:AlternateContent>
+      </w:r>
+    </w:p>
     <w:p/>
     <w:p/>
     <w:p/>
@@ -1040,7 +1460,7 @@
         <mc:AlternateContent>
           <mc:Choice Requires="wpi">
             <w:drawing>
-              <wp:anchor distT="0" distB="0" distL="114300" distR="114300" simplePos="0" relativeHeight="251675648" behindDoc="0" locked="0" layoutInCell="1" allowOverlap="1" wp14:anchorId="786CAC23" wp14:editId="01472523">
+              <wp:anchor distT="0" distB="0" distL="114300" distR="114300" simplePos="0" relativeHeight="251675648" behindDoc="0" locked="0" layoutInCell="1" allowOverlap="1" wp14:anchorId="786CAC23" wp14:editId="2688BFAA">
                 <wp:simplePos x="0" y="0"/>
                 <wp:positionH relativeFrom="column">
                   <wp:posOffset>-246189</wp:posOffset>
@@ -1071,7 +1491,26 @@
           </mc:Choice>
           <mc:Fallback>
             <w:pict>
-              <v:shape w14:anchorId="056B3EAE" id="Ink 25" o:spid="_x0000_s1026" type="#_x0000_t75" style="position:absolute;margin-left:-19.9pt;margin-top:152.45pt;width:475.75pt;height:82.75pt;z-index:251675648;visibility:visible;mso-wrap-style:square;mso-wrap-distance-left:9pt;mso-wrap-distance-top:0;mso-wrap-distance-right:9pt;mso-wrap-distance-bottom:0;mso-position-horizontal:absolute;mso-position-horizontal-relative:text;mso-position-vertical:absolute;mso-position-vertical-relative:text" o:gfxdata="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">
+              <v:shapetype w14:anchorId="349FD764" id="_x0000_t75" coordsize="21600,21600" o:spt="75" o:preferrelative="t" path="m@4@5l@4@11@9@11@9@5xe" filled="f" stroked="f">
+                <v:stroke joinstyle="miter"/>
+                <v:formulas>
+                  <v:f eqn="if lineDrawn pixelLineWidth 0"/>
+                  <v:f eqn="sum @0 1 0"/>
+                  <v:f eqn="sum 0 0 @1"/>
+                  <v:f eqn="prod @2 1 2"/>
+                  <v:f eqn="prod @3 21600 pixelWidth"/>
+                  <v:f eqn="prod @3 21600 pixelHeight"/>
+                  <v:f eqn="sum @0 0 1"/>
+                  <v:f eqn="prod @6 1 2"/>
+                  <v:f eqn="prod @7 21600 pixelWidth"/>
+                  <v:f eqn="sum @8 21600 0"/>
+                  <v:f eqn="prod @7 21600 pixelHeight"/>
+                  <v:f eqn="sum @10 21600 0"/>
+                </v:formulas>
+                <v:path o:extrusionok="f" gradientshapeok="t" o:connecttype="rect"/>
+                <o:lock v:ext="edit" aspectratio="t"/>
+              </v:shapetype>
+              <v:shape id="Ink 25" o:spid="_x0000_s1026" type="#_x0000_t75" style="position:absolute;margin-left:-19.9pt;margin-top:152.45pt;width:475.75pt;height:82.75pt;z-index:251675648;visibility:visible;mso-wrap-style:square;mso-wrap-distance-left:9pt;mso-wrap-distance-top:0;mso-wrap-distance-right:9pt;mso-wrap-distance-bottom:0;mso-position-horizontal:absolute;mso-position-horizontal-relative:text;mso-position-vertical:absolute;mso-position-vertical-relative:text" o:gfxdata="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">
                 <v:imagedata r:id="rId27" o:title=""/>
               </v:shape>
             </w:pict>
@@ -1100,19 +1539,354 @@
       </w:r>
     </w:p>
     <w:p/>
-    <w:p/>
+    <w:p>
+      <w:r>
+        <w:rPr>
+          <w:noProof/>
+        </w:rPr>
+        <mc:AlternateContent>
+          <mc:Choice Requires="wps">
+            <w:drawing>
+              <wp:anchor distT="0" distB="0" distL="114300" distR="114300" simplePos="0" relativeHeight="251691008" behindDoc="0" locked="0" layoutInCell="1" allowOverlap="1" wp14:anchorId="77F4EA22" wp14:editId="1CF41F69">
+                <wp:simplePos x="0" y="0"/>
+                <wp:positionH relativeFrom="column">
+                  <wp:posOffset>1396721</wp:posOffset>
+                </wp:positionH>
+                <wp:positionV relativeFrom="paragraph">
+                  <wp:posOffset>305498</wp:posOffset>
+                </wp:positionV>
+                <wp:extent cx="1024932" cy="492370"/>
+                <wp:effectExtent l="0" t="0" r="16510" b="15875"/>
+                <wp:wrapNone/>
+                <wp:docPr id="895518774" name="Text Box 10"/>
+                <wp:cNvGraphicFramePr/>
+                <a:graphic xmlns:a="http://schemas.openxmlformats.org/drawingml/2006/main">
+                  <a:graphicData uri="http://schemas.microsoft.com/office/word/2010/wordprocessingShape">
+                    <wps:wsp>
+                      <wps:cNvSpPr txBox="1"/>
+                      <wps:spPr>
+                        <a:xfrm>
+                          <a:off x="0" y="0"/>
+                          <a:ext cx="1024932" cy="492370"/>
+                        </a:xfrm>
+                        <a:prstGeom prst="rect">
+                          <a:avLst/>
+                        </a:prstGeom>
+                        <a:solidFill>
+                          <a:schemeClr val="lt1"/>
+                        </a:solidFill>
+                        <a:ln w="6350">
+                          <a:solidFill>
+                            <a:prstClr val="black"/>
+                          </a:solidFill>
+                        </a:ln>
+                      </wps:spPr>
+                      <wps:txbx>
+                        <w:txbxContent>
+                          <w:p>
+                            <w:r>
+                              <w:t>Add to cart button</w:t>
+                            </w:r>
+                          </w:p>
+                        </w:txbxContent>
+                      </wps:txbx>
+                      <wps:bodyPr rot="0" spcFirstLastPara="0" vertOverflow="overflow" horzOverflow="overflow" vert="horz" wrap="square" lIns="91440" tIns="45720" rIns="91440" bIns="45720" numCol="1" spcCol="0" rtlCol="0" fromWordArt="0" anchor="t" anchorCtr="0" forceAA="0" compatLnSpc="1">
+                        <a:prstTxWarp prst="textNoShape">
+                          <a:avLst/>
+                        </a:prstTxWarp>
+                        <a:noAutofit/>
+                      </wps:bodyPr>
+                    </wps:wsp>
+                  </a:graphicData>
+                </a:graphic>
+                <wp14:sizeRelV relativeFrom="margin">
+                  <wp14:pctHeight>0</wp14:pctHeight>
+                </wp14:sizeRelV>
+              </wp:anchor>
+            </w:drawing>
+          </mc:Choice>
+          <mc:Fallback>
+            <w:pict>
+              <v:shape w14:anchorId="77F4EA22" id="_x0000_s1036" type="#_x0000_t202" style="position:absolute;margin-left:110pt;margin-top:24.05pt;width:80.7pt;height:38.75pt;z-index:251691008;visibility:visible;mso-wrap-style:square;mso-height-percent:0;mso-wrap-distance-left:9pt;mso-wrap-distance-top:0;mso-wrap-distance-right:9pt;mso-wrap-distance-bottom:0;mso-position-horizontal:absolute;mso-position-horizontal-relative:text;mso-position-vertical:absolute;mso-position-vertical-relative:text;mso-height-percent:0;mso-height-relative:margin;v-text-anchor:top" o:gfxdata="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" fillcolor="white [3201]" strokeweight=".5pt">
+                <v:textbox>
+                  <w:txbxContent>
+                    <w:p>
+                      <w:r>
+                        <w:t>Add to cart button</w:t>
+                      </w:r>
+                    </w:p>
+                  </w:txbxContent>
+                </v:textbox>
+              </v:shape>
+            </w:pict>
+          </mc:Fallback>
+        </mc:AlternateContent>
+      </w:r>
+      <w:r>
+        <w:rPr>
+          <w:noProof/>
+        </w:rPr>
+        <mc:AlternateContent>
+          <mc:Choice Requires="wps">
+            <w:drawing>
+              <wp:anchor distT="0" distB="0" distL="114300" distR="114300" simplePos="0" relativeHeight="251693056" behindDoc="0" locked="0" layoutInCell="1" allowOverlap="1" wp14:anchorId="7A9B1135" wp14:editId="1645F8CC">
+                <wp:simplePos x="0" y="0"/>
+                <wp:positionH relativeFrom="column">
+                  <wp:posOffset>4776875</wp:posOffset>
+                </wp:positionH>
+                <wp:positionV relativeFrom="paragraph">
+                  <wp:posOffset>246883</wp:posOffset>
+                </wp:positionV>
+                <wp:extent cx="1024932" cy="492370"/>
+                <wp:effectExtent l="0" t="0" r="16510" b="15875"/>
+                <wp:wrapNone/>
+                <wp:docPr id="1247911267" name="Text Box 10"/>
+                <wp:cNvGraphicFramePr/>
+                <a:graphic xmlns:a="http://schemas.openxmlformats.org/drawingml/2006/main">
+                  <a:graphicData uri="http://schemas.microsoft.com/office/word/2010/wordprocessingShape">
+                    <wps:wsp>
+                      <wps:cNvSpPr txBox="1"/>
+                      <wps:spPr>
+                        <a:xfrm>
+                          <a:off x="0" y="0"/>
+                          <a:ext cx="1024932" cy="492370"/>
+                        </a:xfrm>
+                        <a:prstGeom prst="rect">
+                          <a:avLst/>
+                        </a:prstGeom>
+                        <a:solidFill>
+                          <a:schemeClr val="lt1"/>
+                        </a:solidFill>
+                        <a:ln w="6350">
+                          <a:solidFill>
+                            <a:prstClr val="black"/>
+                          </a:solidFill>
+                        </a:ln>
+                      </wps:spPr>
+                      <wps:txbx>
+                        <w:txbxContent>
+                          <w:p>
+                            <w:r>
+                              <w:t>Add to cart button</w:t>
+                            </w:r>
+                          </w:p>
+                        </w:txbxContent>
+                      </wps:txbx>
+                      <wps:bodyPr rot="0" spcFirstLastPara="0" vertOverflow="overflow" horzOverflow="overflow" vert="horz" wrap="square" lIns="91440" tIns="45720" rIns="91440" bIns="45720" numCol="1" spcCol="0" rtlCol="0" fromWordArt="0" anchor="t" anchorCtr="0" forceAA="0" compatLnSpc="1">
+                        <a:prstTxWarp prst="textNoShape">
+                          <a:avLst/>
+                        </a:prstTxWarp>
+                        <a:noAutofit/>
+                      </wps:bodyPr>
+                    </wps:wsp>
+                  </a:graphicData>
+                </a:graphic>
+                <wp14:sizeRelV relativeFrom="margin">
+                  <wp14:pctHeight>0</wp14:pctHeight>
+                </wp14:sizeRelV>
+              </wp:anchor>
+            </w:drawing>
+          </mc:Choice>
+          <mc:Fallback>
+            <w:pict>
+              <v:shape w14:anchorId="7A9B1135" id="_x0000_s1037" type="#_x0000_t202" style="position:absolute;margin-left:376.15pt;margin-top:19.45pt;width:80.7pt;height:38.75pt;z-index:251693056;visibility:visible;mso-wrap-style:square;mso-height-percent:0;mso-wrap-distance-left:9pt;mso-wrap-distance-top:0;mso-wrap-distance-right:9pt;mso-wrap-distance-bottom:0;mso-position-horizontal:absolute;mso-position-horizontal-relative:text;mso-position-vertical:absolute;mso-position-vertical-relative:text;mso-height-percent:0;mso-height-relative:margin;v-text-anchor:top" o:gfxdata="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" fillcolor="white [3201]" strokeweight=".5pt">
+                <v:textbox>
+                  <w:txbxContent>
+                    <w:p>
+                      <w:r>
+                        <w:t>Add to cart button</w:t>
+                      </w:r>
+                    </w:p>
+                  </w:txbxContent>
+                </v:textbox>
+              </v:shape>
+            </w:pict>
+          </mc:Fallback>
+        </mc:AlternateContent>
+      </w:r>
+    </w:p>
     <w:p/>
     <w:p/>
     <w:p/>
     <w:p/>
     <w:p>
       <w:r>
+        <w:rPr>
+          <w:noProof/>
+        </w:rPr>
+        <mc:AlternateContent>
+          <mc:Choice Requires="wps">
+            <w:drawing>
+              <wp:anchor distT="0" distB="0" distL="114300" distR="114300" simplePos="0" relativeHeight="251694080" behindDoc="0" locked="0" layoutInCell="1" allowOverlap="1" wp14:anchorId="62F14E7C" wp14:editId="4F6E1BA7">
+                <wp:simplePos x="0" y="0"/>
+                <wp:positionH relativeFrom="column">
+                  <wp:posOffset>3928905</wp:posOffset>
+                </wp:positionH>
+                <wp:positionV relativeFrom="paragraph">
+                  <wp:posOffset>166223</wp:posOffset>
+                </wp:positionV>
+                <wp:extent cx="1145513" cy="371789"/>
+                <wp:effectExtent l="0" t="0" r="10795" b="9525"/>
+                <wp:wrapNone/>
+                <wp:docPr id="2066720201" name="Text Box 11"/>
+                <wp:cNvGraphicFramePr/>
+                <a:graphic xmlns:a="http://schemas.openxmlformats.org/drawingml/2006/main">
+                  <a:graphicData uri="http://schemas.microsoft.com/office/word/2010/wordprocessingShape">
+                    <wps:wsp>
+                      <wps:cNvSpPr txBox="1"/>
+                      <wps:spPr>
+                        <a:xfrm>
+                          <a:off x="0" y="0"/>
+                          <a:ext cx="1145513" cy="371789"/>
+                        </a:xfrm>
+                        <a:prstGeom prst="rect">
+                          <a:avLst/>
+                        </a:prstGeom>
+                        <a:solidFill>
+                          <a:schemeClr val="lt1"/>
+                        </a:solidFill>
+                        <a:ln w="6350">
+                          <a:solidFill>
+                            <a:prstClr val="black"/>
+                          </a:solidFill>
+                        </a:ln>
+                      </wps:spPr>
+                      <wps:txbx>
+                        <w:txbxContent>
+                          <w:p>
+                            <w:r>
+                              <w:t>Collapse Cart</w:t>
+                            </w:r>
+                          </w:p>
+                        </w:txbxContent>
+                      </wps:txbx>
+                      <wps:bodyPr rot="0" spcFirstLastPara="0" vertOverflow="overflow" horzOverflow="overflow" vert="horz" wrap="square" lIns="91440" tIns="45720" rIns="91440" bIns="45720" numCol="1" spcCol="0" rtlCol="0" fromWordArt="0" anchor="t" anchorCtr="0" forceAA="0" compatLnSpc="1">
+                        <a:prstTxWarp prst="textNoShape">
+                          <a:avLst/>
+                        </a:prstTxWarp>
+                        <a:noAutofit/>
+                      </wps:bodyPr>
+                    </wps:wsp>
+                  </a:graphicData>
+                </a:graphic>
+              </wp:anchor>
+            </w:drawing>
+          </mc:Choice>
+          <mc:Fallback>
+            <w:pict>
+              <v:shape w14:anchorId="62F14E7C" id="Text Box 11" o:spid="_x0000_s1038" type="#_x0000_t202" style="position:absolute;margin-left:309.35pt;margin-top:13.1pt;width:90.2pt;height:29.25pt;z-index:251694080;visibility:visible;mso-wrap-style:square;mso-wrap-distance-left:9pt;mso-wrap-distance-top:0;mso-wrap-distance-right:9pt;mso-wrap-distance-bottom:0;mso-position-horizontal:absolute;mso-position-horizontal-relative:text;mso-position-vertical:absolute;mso-position-vertical-relative:text;v-text-anchor:top" o:gfxdata="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" fillcolor="white [3201]" strokeweight=".5pt">
+                <v:textbox>
+                  <w:txbxContent>
+                    <w:p>
+                      <w:r>
+                        <w:t>Collapse Cart</w:t>
+                      </w:r>
+                    </w:p>
+                  </w:txbxContent>
+                </v:textbox>
+              </v:shape>
+            </w:pict>
+          </mc:Fallback>
+        </mc:AlternateContent>
+      </w:r>
+      <w:r>
         <w:t>Shopping Cart</w:t>
       </w:r>
     </w:p>
     <w:p/>
     <w:p/>
     <w:p>
+      <w:r>
+        <w:rPr>
+          <w:noProof/>
+        </w:rPr>
+        <mc:AlternateContent>
+          <mc:Choice Requires="wps">
+            <w:drawing>
+              <wp:anchor distT="0" distB="0" distL="114300" distR="114300" simplePos="0" relativeHeight="251683840" behindDoc="0" locked="0" layoutInCell="1" allowOverlap="1" wp14:anchorId="79355F2F" wp14:editId="6F2962E9">
+                <wp:simplePos x="0" y="0"/>
+                <wp:positionH relativeFrom="column">
+                  <wp:posOffset>4983982</wp:posOffset>
+                </wp:positionH>
+                <wp:positionV relativeFrom="paragraph">
+                  <wp:posOffset>69103</wp:posOffset>
+                </wp:positionV>
+                <wp:extent cx="894304" cy="503178"/>
+                <wp:effectExtent l="0" t="0" r="7620" b="17780"/>
+                <wp:wrapNone/>
+                <wp:docPr id="1814141698" name="Text Box 8"/>
+                <wp:cNvGraphicFramePr/>
+                <a:graphic xmlns:a="http://schemas.openxmlformats.org/drawingml/2006/main">
+                  <a:graphicData uri="http://schemas.microsoft.com/office/word/2010/wordprocessingShape">
+                    <wps:wsp>
+                      <wps:cNvSpPr txBox="1"/>
+                      <wps:spPr>
+                        <a:xfrm>
+                          <a:off x="0" y="0"/>
+                          <a:ext cx="894304" cy="503178"/>
+                        </a:xfrm>
+                        <a:prstGeom prst="rect">
+                          <a:avLst/>
+                        </a:prstGeom>
+                        <a:solidFill>
+                          <a:schemeClr val="lt1"/>
+                        </a:solidFill>
+                        <a:ln w="6350">
+                          <a:solidFill>
+                            <a:prstClr val="black"/>
+                          </a:solidFill>
+                        </a:ln>
+                      </wps:spPr>
+                      <wps:txbx>
+                        <w:txbxContent>
+                          <w:p>
+                            <w:r>
+                              <w:t>Remove Button</w:t>
+                            </w:r>
+                            <w:r>
+                              <w:t xml:space="preserve"> (X)</w:t>
+                            </w:r>
+                          </w:p>
+                        </w:txbxContent>
+                      </wps:txbx>
+                      <wps:bodyPr rot="0" spcFirstLastPara="0" vertOverflow="overflow" horzOverflow="overflow" vert="horz" wrap="square" lIns="91440" tIns="45720" rIns="91440" bIns="45720" numCol="1" spcCol="0" rtlCol="0" fromWordArt="0" anchor="t" anchorCtr="0" forceAA="0" compatLnSpc="1">
+                        <a:prstTxWarp prst="textNoShape">
+                          <a:avLst/>
+                        </a:prstTxWarp>
+                        <a:noAutofit/>
+                      </wps:bodyPr>
+                    </wps:wsp>
+                  </a:graphicData>
+                </a:graphic>
+                <wp14:sizeRelH relativeFrom="margin">
+                  <wp14:pctWidth>0</wp14:pctWidth>
+                </wp14:sizeRelH>
+                <wp14:sizeRelV relativeFrom="margin">
+                  <wp14:pctHeight>0</wp14:pctHeight>
+                </wp14:sizeRelV>
+              </wp:anchor>
+            </w:drawing>
+          </mc:Choice>
+          <mc:Fallback>
+            <w:pict>
+              <v:shape w14:anchorId="79355F2F" id="_x0000_s1039" type="#_x0000_t202" style="position:absolute;margin-left:392.45pt;margin-top:5.45pt;width:70.4pt;height:39.6pt;z-index:251683840;visibility:visible;mso-wrap-style:square;mso-width-percent:0;mso-height-percent:0;mso-wrap-distance-left:9pt;mso-wrap-distance-top:0;mso-wrap-distance-right:9pt;mso-wrap-distance-bottom:0;mso-position-horizontal:absolute;mso-position-horizontal-relative:text;mso-position-vertical:absolute;mso-position-vertical-relative:text;mso-width-percent:0;mso-height-percent:0;mso-width-relative:margin;mso-height-relative:margin;v-text-anchor:top" o:gfxdata="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" fillcolor="white [3201]" strokeweight=".5pt">
+                <v:textbox>
+                  <w:txbxContent>
+                    <w:p>
+                      <w:r>
+                        <w:t>Remove Button</w:t>
+                      </w:r>
+                      <w:r>
+                        <w:t xml:space="preserve"> (X)</w:t>
+                      </w:r>
+                    </w:p>
+                  </w:txbxContent>
+                </v:textbox>
+              </v:shape>
+            </w:pict>
+          </mc:Fallback>
+        </mc:AlternateContent>
+      </w:r>
       <w:r>
         <w:rPr>
           <w:noProof/>
@@ -1231,7 +2005,99 @@
       </w:r>
     </w:p>
     <w:p/>
-    <w:p/>
+    <w:p>
+      <w:r>
+        <w:rPr>
+          <w:noProof/>
+        </w:rPr>
+        <mc:AlternateContent>
+          <mc:Choice Requires="wps">
+            <w:drawing>
+              <wp:anchor distT="0" distB="0" distL="114300" distR="114300" simplePos="0" relativeHeight="251685888" behindDoc="0" locked="0" layoutInCell="1" allowOverlap="1" wp14:anchorId="5C7B57A0" wp14:editId="0405F064">
+                <wp:simplePos x="0" y="0"/>
+                <wp:positionH relativeFrom="column">
+                  <wp:posOffset>4983982</wp:posOffset>
+                </wp:positionH>
+                <wp:positionV relativeFrom="paragraph">
+                  <wp:posOffset>238606</wp:posOffset>
+                </wp:positionV>
+                <wp:extent cx="894080" cy="503178"/>
+                <wp:effectExtent l="0" t="0" r="7620" b="17780"/>
+                <wp:wrapNone/>
+                <wp:docPr id="756525817" name="Text Box 8"/>
+                <wp:cNvGraphicFramePr/>
+                <a:graphic xmlns:a="http://schemas.openxmlformats.org/drawingml/2006/main">
+                  <a:graphicData uri="http://schemas.microsoft.com/office/word/2010/wordprocessingShape">
+                    <wps:wsp>
+                      <wps:cNvSpPr txBox="1"/>
+                      <wps:spPr>
+                        <a:xfrm>
+                          <a:off x="0" y="0"/>
+                          <a:ext cx="894080" cy="503178"/>
+                        </a:xfrm>
+                        <a:prstGeom prst="rect">
+                          <a:avLst/>
+                        </a:prstGeom>
+                        <a:solidFill>
+                          <a:schemeClr val="lt1"/>
+                        </a:solidFill>
+                        <a:ln w="6350">
+                          <a:solidFill>
+                            <a:prstClr val="black"/>
+                          </a:solidFill>
+                        </a:ln>
+                      </wps:spPr>
+                      <wps:txbx>
+                        <w:txbxContent>
+                          <w:p>
+                            <w:r>
+                              <w:t>Remove Button</w:t>
+                            </w:r>
+                            <w:r>
+                              <w:t xml:space="preserve"> (X)</w:t>
+                            </w:r>
+                          </w:p>
+                        </w:txbxContent>
+                      </wps:txbx>
+                      <wps:bodyPr rot="0" spcFirstLastPara="0" vertOverflow="overflow" horzOverflow="overflow" vert="horz" wrap="square" lIns="91440" tIns="45720" rIns="91440" bIns="45720" numCol="1" spcCol="0" rtlCol="0" fromWordArt="0" anchor="t" anchorCtr="0" forceAA="0" compatLnSpc="1">
+                        <a:prstTxWarp prst="textNoShape">
+                          <a:avLst/>
+                        </a:prstTxWarp>
+                        <a:noAutofit/>
+                      </wps:bodyPr>
+                    </wps:wsp>
+                  </a:graphicData>
+                </a:graphic>
+                <wp14:sizeRelH relativeFrom="margin">
+                  <wp14:pctWidth>0</wp14:pctWidth>
+                </wp14:sizeRelH>
+                <wp14:sizeRelV relativeFrom="margin">
+                  <wp14:pctHeight>0</wp14:pctHeight>
+                </wp14:sizeRelV>
+              </wp:anchor>
+            </w:drawing>
+          </mc:Choice>
+          <mc:Fallback>
+            <w:pict>
+              <v:shape w14:anchorId="5C7B57A0" id="_x0000_s1040" type="#_x0000_t202" style="position:absolute;margin-left:392.45pt;margin-top:18.8pt;width:70.4pt;height:39.6pt;z-index:251685888;visibility:visible;mso-wrap-style:square;mso-width-percent:0;mso-height-percent:0;mso-wrap-distance-left:9pt;mso-wrap-distance-top:0;mso-wrap-distance-right:9pt;mso-wrap-distance-bottom:0;mso-position-horizontal:absolute;mso-position-horizontal-relative:text;mso-position-vertical:absolute;mso-position-vertical-relative:text;mso-width-percent:0;mso-height-percent:0;mso-width-relative:margin;mso-height-relative:margin;v-text-anchor:top" o:gfxdata="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" fillcolor="white [3201]" strokeweight=".5pt">
+                <v:textbox>
+                  <w:txbxContent>
+                    <w:p>
+                      <w:r>
+                        <w:t>Remove Button</w:t>
+                      </w:r>
+                      <w:r>
+                        <w:t xml:space="preserve"> (X)</w:t>
+                      </w:r>
+                    </w:p>
+                  </w:txbxContent>
+                </v:textbox>
+              </v:shape>
+            </w:pict>
+          </mc:Fallback>
+        </mc:AlternateContent>
+      </w:r>
+    </w:p>
     <w:p>
       <w:r>
         <w:tab/>
@@ -1334,7 +2200,7 @@
           </mc:Choice>
           <mc:Fallback>
             <w:pict>
-              <v:shape w14:anchorId="7F87288B" id="Text Box 34" o:spid="_x0000_s1031" type="#_x0000_t202" style="position:absolute;margin-left:253.2pt;margin-top:19.5pt;width:102.05pt;height:22.15pt;z-index:251682816;visibility:visible;mso-wrap-style:square;mso-wrap-distance-left:9pt;mso-wrap-distance-top:0;mso-wrap-distance-right:9pt;mso-wrap-distance-bottom:0;mso-position-horizontal:absolute;mso-position-horizontal-relative:text;mso-position-vertical:absolute;mso-position-vertical-relative:text;v-text-anchor:top" o:gfxdata="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" fillcolor="white [3201]" strokeweight=".5pt">
+              <v:shape w14:anchorId="7F87288B" id="Text Box 34" o:spid="_x0000_s1041" type="#_x0000_t202" style="position:absolute;margin-left:253.2pt;margin-top:19.5pt;width:102.05pt;height:22.15pt;z-index:251682816;visibility:visible;mso-wrap-style:square;mso-wrap-distance-left:9pt;mso-wrap-distance-top:0;mso-wrap-distance-right:9pt;mso-wrap-distance-bottom:0;mso-position-horizontal:absolute;mso-position-horizontal-relative:text;mso-position-vertical:absolute;mso-position-vertical-relative:text;v-text-anchor:top" o:gfxdata="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" fillcolor="white [3201]" strokeweight=".5pt">
                 <v:textbox>
                   <w:txbxContent>
                     <w:p>
@@ -1396,13 +2262,8 @@
                         <w:txbxContent>
                           <w:p>
                             <w:r>
-                              <w:t xml:space="preserve">Place Order </w:t>
+                              <w:t>Place Order Button</w:t>
                             </w:r>
-                            <w:proofErr w:type="spellStart"/>
-                            <w:r>
-                              <w:t>Button</w:t>
-                            </w:r>
-                            <w:proofErr w:type="spellEnd"/>
                           </w:p>
                         </w:txbxContent>
                       </wps:txbx>
@@ -1423,18 +2284,13 @@
           </mc:Choice>
           <mc:Fallback>
             <w:pict>
-              <v:shape w14:anchorId="42D5E272" id="Text Box 30" o:spid="_x0000_s1032" type="#_x0000_t202" style="position:absolute;margin-left:136.8pt;margin-top:23pt;width:121.05pt;height:20.55pt;z-index:251680768;visibility:visible;mso-wrap-style:square;mso-width-percent:0;mso-wrap-distance-left:9pt;mso-wrap-distance-top:0;mso-wrap-distance-right:9pt;mso-wrap-distance-bottom:0;mso-position-horizontal:absolute;mso-position-horizontal-relative:text;mso-position-vertical:absolute;mso-position-vertical-relative:text;mso-width-percent:0;mso-width-relative:margin;v-text-anchor:top" o:gfxdata="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" fillcolor="white [3201]" strokeweight=".5pt">
+              <v:shape w14:anchorId="42D5E272" id="Text Box 30" o:spid="_x0000_s1042" type="#_x0000_t202" style="position:absolute;margin-left:136.8pt;margin-top:23pt;width:121.05pt;height:20.55pt;z-index:251680768;visibility:visible;mso-wrap-style:square;mso-width-percent:0;mso-wrap-distance-left:9pt;mso-wrap-distance-top:0;mso-wrap-distance-right:9pt;mso-wrap-distance-bottom:0;mso-position-horizontal:absolute;mso-position-horizontal-relative:text;mso-position-vertical:absolute;mso-position-vertical-relative:text;mso-width-percent:0;mso-width-relative:margin;v-text-anchor:top" o:gfxdata="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" fillcolor="white [3201]" strokeweight=".5pt">
                 <v:textbox>
                   <w:txbxContent>
                     <w:p>
                       <w:r>
-                        <w:t xml:space="preserve">Place Order </w:t>
+                        <w:t>Place Order Button</w:t>
                       </w:r>
-                      <w:proofErr w:type="spellStart"/>
-                      <w:r>
-                        <w:t>Button</w:t>
-                      </w:r>
-                      <w:proofErr w:type="spellEnd"/>
                     </w:p>
                   </w:txbxContent>
                 </v:textbox>

</xml_diff>